<commit_message>
Add color themes: Classic, Light, Crimson & White, Amber
- Refactored hardcoded colors in styles.css into CSS custom properties
  (--bg, --panel, --display-bg, --accent/--on-accent, --accent-2/--on-accent-2,
  --text, --text-dim, --key-bg/--key-bg-hover, --num-bg, --sci-bg/--sci-text,
  --fn-bg, --danger, --bg-glow)
- Added three [data-theme=] override blocks: light, crimson (Univ. of Alabama
  colors), and amber (retro LED/LCD look); Classic is the bare :root default
- Added a Theme toggle button next to DEG/RAD in index.html that cycles
  through the four themes via app.js, persisting the choice to localStorage
  under rpn-theme (same pattern as the tray-collapsed toggle)
- The paper tape intentionally keeps its own fixed cream/ink colors across
  all themes, like real adding-machine paper
- Updated USER_MANUAL.md/.docx and TECHNICAL_MANUAL.md/.docx with a Themes
  section and technical writeup
</commit_message>
<xml_diff>
--- a/TECHNICAL_MANUAL.docx
+++ b/TECHNICAL_MANUAL.docx
@@ -3792,6 +3792,580 @@
         <w:spacing w:after="100" w:before="240"/>
       </w:pPr>
       <w:r>
+        <w:t xml:space="preserve">Theming</w:t>
+      </w:r>
+    </w:p>
+    <w:p>
+      <w:pPr>
+        <w:spacing w:after="160"/>
+      </w:pPr>
+      <w:r>
+        <w:t xml:space="preserve">All colors are CSS custom properties declared on </w:t>
+      </w:r>
+      <w:r>
+        <w:rPr>
+          <w:rFonts w:ascii="Consolas" w:cs="Consolas" w:eastAsia="Consolas" w:hAnsi="Consolas"/>
+          <w:sz w:val="20"/>
+          <w:szCs w:val="20"/>
+          <w:shd w:fill="EDEDED" w:val="clear"/>
+        </w:rPr>
+        <w:t xml:space="preserve">:root</w:t>
+      </w:r>
+      <w:r>
+        <w:t xml:space="preserve"> in </w:t>
+      </w:r>
+      <w:r>
+        <w:rPr>
+          <w:rFonts w:ascii="Consolas" w:cs="Consolas" w:eastAsia="Consolas" w:hAnsi="Consolas"/>
+          <w:sz w:val="20"/>
+          <w:szCs w:val="20"/>
+          <w:shd w:fill="EDEDED" w:val="clear"/>
+        </w:rPr>
+        <w:t xml:space="preserve">styles.css</w:t>
+      </w:r>
+      <w:r>
+        <w:t xml:space="preserve"> — </w:t>
+      </w:r>
+      <w:r>
+        <w:rPr>
+          <w:rFonts w:ascii="Consolas" w:cs="Consolas" w:eastAsia="Consolas" w:hAnsi="Consolas"/>
+          <w:sz w:val="20"/>
+          <w:szCs w:val="20"/>
+          <w:shd w:fill="EDEDED" w:val="clear"/>
+        </w:rPr>
+        <w:t xml:space="preserve">--bg</w:t>
+      </w:r>
+      <w:r>
+        <w:t xml:space="preserve">, </w:t>
+      </w:r>
+      <w:r>
+        <w:rPr>
+          <w:rFonts w:ascii="Consolas" w:cs="Consolas" w:eastAsia="Consolas" w:hAnsi="Consolas"/>
+          <w:sz w:val="20"/>
+          <w:szCs w:val="20"/>
+          <w:shd w:fill="EDEDED" w:val="clear"/>
+        </w:rPr>
+        <w:t xml:space="preserve">--bg-glow</w:t>
+      </w:r>
+      <w:r>
+        <w:t xml:space="preserve"> (the radial-gradient highlight behind the header), </w:t>
+      </w:r>
+      <w:r>
+        <w:rPr>
+          <w:rFonts w:ascii="Consolas" w:cs="Consolas" w:eastAsia="Consolas" w:hAnsi="Consolas"/>
+          <w:sz w:val="20"/>
+          <w:szCs w:val="20"/>
+          <w:shd w:fill="EDEDED" w:val="clear"/>
+        </w:rPr>
+        <w:t xml:space="preserve">--panel</w:t>
+      </w:r>
+      <w:r>
+        <w:t xml:space="preserve">, </w:t>
+      </w:r>
+      <w:r>
+        <w:rPr>
+          <w:rFonts w:ascii="Consolas" w:cs="Consolas" w:eastAsia="Consolas" w:hAnsi="Consolas"/>
+          <w:sz w:val="20"/>
+          <w:szCs w:val="20"/>
+          <w:shd w:fill="EDEDED" w:val="clear"/>
+        </w:rPr>
+        <w:t xml:space="preserve">--display-bg</w:t>
+      </w:r>
+      <w:r>
+        <w:t xml:space="preserve">, </w:t>
+      </w:r>
+      <w:r>
+        <w:rPr>
+          <w:rFonts w:ascii="Consolas" w:cs="Consolas" w:eastAsia="Consolas" w:hAnsi="Consolas"/>
+          <w:sz w:val="20"/>
+          <w:szCs w:val="20"/>
+          <w:shd w:fill="EDEDED" w:val="clear"/>
+        </w:rPr>
+        <w:t xml:space="preserve">--accent</w:t>
+      </w:r>
+      <w:r>
+        <w:t xml:space="preserve">/</w:t>
+      </w:r>
+      <w:r>
+        <w:rPr>
+          <w:rFonts w:ascii="Consolas" w:cs="Consolas" w:eastAsia="Consolas" w:hAnsi="Consolas"/>
+          <w:sz w:val="20"/>
+          <w:szCs w:val="20"/>
+          <w:shd w:fill="EDEDED" w:val="clear"/>
+        </w:rPr>
+        <w:t xml:space="preserve">--on-accent</w:t>
+      </w:r>
+      <w:r>
+        <w:t xml:space="preserve">, </w:t>
+      </w:r>
+      <w:r>
+        <w:rPr>
+          <w:rFonts w:ascii="Consolas" w:cs="Consolas" w:eastAsia="Consolas" w:hAnsi="Consolas"/>
+          <w:sz w:val="20"/>
+          <w:szCs w:val="20"/>
+          <w:shd w:fill="EDEDED" w:val="clear"/>
+        </w:rPr>
+        <w:t xml:space="preserve">--accent-2</w:t>
+      </w:r>
+      <w:r>
+        <w:t xml:space="preserve">/</w:t>
+      </w:r>
+      <w:r>
+        <w:rPr>
+          <w:rFonts w:ascii="Consolas" w:cs="Consolas" w:eastAsia="Consolas" w:hAnsi="Consolas"/>
+          <w:sz w:val="20"/>
+          <w:szCs w:val="20"/>
+          <w:shd w:fill="EDEDED" w:val="clear"/>
+        </w:rPr>
+        <w:t xml:space="preserve">--on-accent-2</w:t>
+      </w:r>
+      <w:r>
+        <w:t xml:space="preserve">, </w:t>
+      </w:r>
+      <w:r>
+        <w:rPr>
+          <w:rFonts w:ascii="Consolas" w:cs="Consolas" w:eastAsia="Consolas" w:hAnsi="Consolas"/>
+          <w:sz w:val="20"/>
+          <w:szCs w:val="20"/>
+          <w:shd w:fill="EDEDED" w:val="clear"/>
+        </w:rPr>
+        <w:t xml:space="preserve">--text</w:t>
+      </w:r>
+      <w:r>
+        <w:t xml:space="preserve">, </w:t>
+      </w:r>
+      <w:r>
+        <w:rPr>
+          <w:rFonts w:ascii="Consolas" w:cs="Consolas" w:eastAsia="Consolas" w:hAnsi="Consolas"/>
+          <w:sz w:val="20"/>
+          <w:szCs w:val="20"/>
+          <w:shd w:fill="EDEDED" w:val="clear"/>
+        </w:rPr>
+        <w:t xml:space="preserve">--text-dim</w:t>
+      </w:r>
+      <w:r>
+        <w:t xml:space="preserve">, </w:t>
+      </w:r>
+      <w:r>
+        <w:rPr>
+          <w:rFonts w:ascii="Consolas" w:cs="Consolas" w:eastAsia="Consolas" w:hAnsi="Consolas"/>
+          <w:sz w:val="20"/>
+          <w:szCs w:val="20"/>
+          <w:shd w:fill="EDEDED" w:val="clear"/>
+        </w:rPr>
+        <w:t xml:space="preserve">--key-bg</w:t>
+      </w:r>
+      <w:r>
+        <w:t xml:space="preserve">/</w:t>
+      </w:r>
+      <w:r>
+        <w:rPr>
+          <w:rFonts w:ascii="Consolas" w:cs="Consolas" w:eastAsia="Consolas" w:hAnsi="Consolas"/>
+          <w:sz w:val="20"/>
+          <w:szCs w:val="20"/>
+          <w:shd w:fill="EDEDED" w:val="clear"/>
+        </w:rPr>
+        <w:t xml:space="preserve">--key-bg-hover</w:t>
+      </w:r>
+      <w:r>
+        <w:t xml:space="preserve">, </w:t>
+      </w:r>
+      <w:r>
+        <w:rPr>
+          <w:rFonts w:ascii="Consolas" w:cs="Consolas" w:eastAsia="Consolas" w:hAnsi="Consolas"/>
+          <w:sz w:val="20"/>
+          <w:szCs w:val="20"/>
+          <w:shd w:fill="EDEDED" w:val="clear"/>
+        </w:rPr>
+        <w:t xml:space="preserve">--num-bg</w:t>
+      </w:r>
+      <w:r>
+        <w:t xml:space="preserve">, </w:t>
+      </w:r>
+      <w:r>
+        <w:rPr>
+          <w:rFonts w:ascii="Consolas" w:cs="Consolas" w:eastAsia="Consolas" w:hAnsi="Consolas"/>
+          <w:sz w:val="20"/>
+          <w:szCs w:val="20"/>
+          <w:shd w:fill="EDEDED" w:val="clear"/>
+        </w:rPr>
+        <w:t xml:space="preserve">--sci-bg</w:t>
+      </w:r>
+      <w:r>
+        <w:t xml:space="preserve">/</w:t>
+      </w:r>
+      <w:r>
+        <w:rPr>
+          <w:rFonts w:ascii="Consolas" w:cs="Consolas" w:eastAsia="Consolas" w:hAnsi="Consolas"/>
+          <w:sz w:val="20"/>
+          <w:szCs w:val="20"/>
+          <w:shd w:fill="EDEDED" w:val="clear"/>
+        </w:rPr>
+        <w:t xml:space="preserve">--sci-text</w:t>
+      </w:r>
+      <w:r>
+        <w:t xml:space="preserve">, </w:t>
+      </w:r>
+      <w:r>
+        <w:rPr>
+          <w:rFonts w:ascii="Consolas" w:cs="Consolas" w:eastAsia="Consolas" w:hAnsi="Consolas"/>
+          <w:sz w:val="20"/>
+          <w:szCs w:val="20"/>
+          <w:shd w:fill="EDEDED" w:val="clear"/>
+        </w:rPr>
+        <w:t xml:space="preserve">--fn-bg</w:t>
+      </w:r>
+      <w:r>
+        <w:t xml:space="preserve">, and </w:t>
+      </w:r>
+      <w:r>
+        <w:rPr>
+          <w:rFonts w:ascii="Consolas" w:cs="Consolas" w:eastAsia="Consolas" w:hAnsi="Consolas"/>
+          <w:sz w:val="20"/>
+          <w:szCs w:val="20"/>
+          <w:shd w:fill="EDEDED" w:val="clear"/>
+        </w:rPr>
+        <w:t xml:space="preserve">--danger</w:t>
+      </w:r>
+      <w:r>
+        <w:t xml:space="preserve">. Every color-related rule in the file reads one of these variables instead of a literal hex value, so a "theme" is just a block that redeclares the same variable names with different values — no other CSS had to change to support theming.</w:t>
+      </w:r>
+    </w:p>
+    <w:p>
+      <w:pPr>
+        <w:spacing w:after="80" w:before="80"/>
+      </w:pPr>
+      <w:r>
+        <w:t xml:space="preserve">Three theme blocks — </w:t>
+      </w:r>
+      <w:r>
+        <w:rPr>
+          <w:rFonts w:ascii="Consolas" w:cs="Consolas" w:eastAsia="Consolas" w:hAnsi="Consolas"/>
+          <w:sz w:val="20"/>
+          <w:szCs w:val="20"/>
+          <w:shd w:fill="EDEDED" w:val="clear"/>
+        </w:rPr>
+        <w:t xml:space="preserve">[data-theme="light"]</w:t>
+      </w:r>
+      <w:r>
+        <w:t xml:space="preserve">, </w:t>
+      </w:r>
+      <w:r>
+        <w:rPr>
+          <w:rFonts w:ascii="Consolas" w:cs="Consolas" w:eastAsia="Consolas" w:hAnsi="Consolas"/>
+          <w:sz w:val="20"/>
+          <w:szCs w:val="20"/>
+          <w:shd w:fill="EDEDED" w:val="clear"/>
+        </w:rPr>
+        <w:t xml:space="preserve">[data-theme="crimson"]</w:t>
+      </w:r>
+      <w:r>
+        <w:t xml:space="preserve">, </w:t>
+      </w:r>
+      <w:r>
+        <w:rPr>
+          <w:rFonts w:ascii="Consolas" w:cs="Consolas" w:eastAsia="Consolas" w:hAnsi="Consolas"/>
+          <w:sz w:val="20"/>
+          <w:szCs w:val="20"/>
+          <w:shd w:fill="EDEDED" w:val="clear"/>
+        </w:rPr>
+        <w:t xml:space="preserve">[data-theme="amber"]</w:t>
+      </w:r>
+      <w:r>
+        <w:t xml:space="preserve"> — sit right after </w:t>
+      </w:r>
+      <w:r>
+        <w:rPr>
+          <w:rFonts w:ascii="Consolas" w:cs="Consolas" w:eastAsia="Consolas" w:hAnsi="Consolas"/>
+          <w:sz w:val="20"/>
+          <w:szCs w:val="20"/>
+          <w:shd w:fill="EDEDED" w:val="clear"/>
+        </w:rPr>
+        <w:t xml:space="preserve">:root</w:t>
+      </w:r>
+      <w:r>
+        <w:t xml:space="preserve"> and override the variables whenever that attribute is present on </w:t>
+      </w:r>
+      <w:r>
+        <w:rPr>
+          <w:rFonts w:ascii="Consolas" w:cs="Consolas" w:eastAsia="Consolas" w:hAnsi="Consolas"/>
+          <w:sz w:val="20"/>
+          <w:szCs w:val="20"/>
+          <w:shd w:fill="EDEDED" w:val="clear"/>
+        </w:rPr>
+        <w:t xml:space="preserve">&lt;html&gt;</w:t>
+      </w:r>
+      <w:r>
+        <w:t xml:space="preserve">. The default ("Classic") theme is simply the bare </w:t>
+      </w:r>
+      <w:r>
+        <w:rPr>
+          <w:rFonts w:ascii="Consolas" w:cs="Consolas" w:eastAsia="Consolas" w:hAnsi="Consolas"/>
+          <w:sz w:val="20"/>
+          <w:szCs w:val="20"/>
+          <w:shd w:fill="EDEDED" w:val="clear"/>
+        </w:rPr>
+        <w:t xml:space="preserve">:root</w:t>
+      </w:r>
+      <w:r>
+        <w:t xml:space="preserve"> values with no </w:t>
+      </w:r>
+      <w:r>
+        <w:rPr>
+          <w:rFonts w:ascii="Consolas" w:cs="Consolas" w:eastAsia="Consolas" w:hAnsi="Consolas"/>
+          <w:sz w:val="20"/>
+          <w:szCs w:val="20"/>
+          <w:shd w:fill="EDEDED" w:val="clear"/>
+        </w:rPr>
+        <w:t xml:space="preserve">data-theme</w:t>
+      </w:r>
+      <w:r>
+        <w:t xml:space="preserve"> attribute at all, so existing saved state with nothing set still renders exactly as before the feature was added.</w:t>
+      </w:r>
+    </w:p>
+    <w:p>
+      <w:pPr>
+        <w:spacing w:after="80" w:before="0"/>
+      </w:pPr>
+      <w:r>
+        <w:rPr>
+          <w:rFonts w:ascii="Consolas" w:cs="Consolas" w:eastAsia="Consolas" w:hAnsi="Consolas"/>
+          <w:sz w:val="20"/>
+          <w:szCs w:val="20"/>
+          <w:shd w:fill="EDEDED" w:val="clear"/>
+        </w:rPr>
+        <w:t xml:space="preserve">app.js</w:t>
+      </w:r>
+      <w:r>
+        <w:t xml:space="preserve"> defines a </w:t>
+      </w:r>
+      <w:r>
+        <w:rPr>
+          <w:rFonts w:ascii="Consolas" w:cs="Consolas" w:eastAsia="Consolas" w:hAnsi="Consolas"/>
+          <w:sz w:val="20"/>
+          <w:szCs w:val="20"/>
+          <w:shd w:fill="EDEDED" w:val="clear"/>
+        </w:rPr>
+        <w:t xml:space="preserve">THEMES</w:t>
+      </w:r>
+      <w:r>
+        <w:t xml:space="preserve"> array of </w:t>
+      </w:r>
+      <w:r>
+        <w:rPr>
+          <w:rFonts w:ascii="Consolas" w:cs="Consolas" w:eastAsia="Consolas" w:hAnsi="Consolas"/>
+          <w:sz w:val="20"/>
+          <w:szCs w:val="20"/>
+          <w:shd w:fill="EDEDED" w:val="clear"/>
+        </w:rPr>
+        <w:t xml:space="preserve">{ id, label }</w:t>
+      </w:r>
+      <w:r>
+        <w:t xml:space="preserve"> pairs and a </w:t>
+      </w:r>
+      <w:r>
+        <w:rPr>
+          <w:rFonts w:ascii="Consolas" w:cs="Consolas" w:eastAsia="Consolas" w:hAnsi="Consolas"/>
+          <w:sz w:val="20"/>
+          <w:szCs w:val="20"/>
+          <w:shd w:fill="EDEDED" w:val="clear"/>
+        </w:rPr>
+        <w:t xml:space="preserve">setTheme(id)</w:t>
+      </w:r>
+      <w:r>
+        <w:t xml:space="preserve"> function that sets or removes </w:t>
+      </w:r>
+      <w:r>
+        <w:rPr>
+          <w:rFonts w:ascii="Consolas" w:cs="Consolas" w:eastAsia="Consolas" w:hAnsi="Consolas"/>
+          <w:sz w:val="20"/>
+          <w:szCs w:val="20"/>
+          <w:shd w:fill="EDEDED" w:val="clear"/>
+        </w:rPr>
+        <w:t xml:space="preserve">document.documentElement.dataset.theme</w:t>
+      </w:r>
+      <w:r>
+        <w:t xml:space="preserve">, updates the toggle button's label, and persists the choice to </w:t>
+      </w:r>
+      <w:r>
+        <w:rPr>
+          <w:rFonts w:ascii="Consolas" w:cs="Consolas" w:eastAsia="Consolas" w:hAnsi="Consolas"/>
+          <w:sz w:val="20"/>
+          <w:szCs w:val="20"/>
+          <w:shd w:fill="EDEDED" w:val="clear"/>
+        </w:rPr>
+        <w:t xml:space="preserve">localStorage</w:t>
+      </w:r>
+      <w:r>
+        <w:t xml:space="preserve"> under </w:t>
+      </w:r>
+      <w:r>
+        <w:rPr>
+          <w:rFonts w:ascii="Consolas" w:cs="Consolas" w:eastAsia="Consolas" w:hAnsi="Consolas"/>
+          <w:sz w:val="20"/>
+          <w:szCs w:val="20"/>
+          <w:shd w:fill="EDEDED" w:val="clear"/>
+        </w:rPr>
+        <w:t xml:space="preserve">rpn-theme</w:t>
+      </w:r>
+      <w:r>
+        <w:t xml:space="preserve"> — the same pattern (including the </w:t>
+      </w:r>
+      <w:r>
+        <w:rPr>
+          <w:rFonts w:ascii="Consolas" w:cs="Consolas" w:eastAsia="Consolas" w:hAnsi="Consolas"/>
+          <w:sz w:val="20"/>
+          <w:szCs w:val="20"/>
+          <w:shd w:fill="EDEDED" w:val="clear"/>
+        </w:rPr>
+        <w:t xml:space="preserve">try/catch</w:t>
+      </w:r>
+      <w:r>
+        <w:t xml:space="preserve"> around </w:t>
+      </w:r>
+      <w:r>
+        <w:rPr>
+          <w:rFonts w:ascii="Consolas" w:cs="Consolas" w:eastAsia="Consolas" w:hAnsi="Consolas"/>
+          <w:sz w:val="20"/>
+          <w:szCs w:val="20"/>
+          <w:shd w:fill="EDEDED" w:val="clear"/>
+        </w:rPr>
+        <w:t xml:space="preserve">localStorage</w:t>
+      </w:r>
+      <w:r>
+        <w:t xml:space="preserve">) used for the tray's collapsed state. </w:t>
+      </w:r>
+      <w:r>
+        <w:rPr>
+          <w:rFonts w:ascii="Consolas" w:cs="Consolas" w:eastAsia="Consolas" w:hAnsi="Consolas"/>
+          <w:sz w:val="20"/>
+          <w:szCs w:val="20"/>
+          <w:shd w:fill="EDEDED" w:val="clear"/>
+        </w:rPr>
+        <w:t xml:space="preserve">initTheme()</w:t>
+      </w:r>
+      <w:r>
+        <w:t xml:space="preserve"> runs once at startup and applies the saved theme, defaulting to </w:t>
+      </w:r>
+      <w:r>
+        <w:rPr>
+          <w:rFonts w:ascii="Consolas" w:cs="Consolas" w:eastAsia="Consolas" w:hAnsi="Consolas"/>
+          <w:sz w:val="20"/>
+          <w:szCs w:val="20"/>
+          <w:shd w:fill="EDEDED" w:val="clear"/>
+        </w:rPr>
+        <w:t xml:space="preserve">"classic"</w:t>
+      </w:r>
+      <w:r>
+        <w:t xml:space="preserve"> if nothing is stored. Clicking the Theme button (</w:t>
+      </w:r>
+      <w:r>
+        <w:rPr>
+          <w:rFonts w:ascii="Consolas" w:cs="Consolas" w:eastAsia="Consolas" w:hAnsi="Consolas"/>
+          <w:sz w:val="20"/>
+          <w:szCs w:val="20"/>
+          <w:shd w:fill="EDEDED" w:val="clear"/>
+        </w:rPr>
+        <w:t xml:space="preserve">#themeToggle</w:t>
+      </w:r>
+      <w:r>
+        <w:t xml:space="preserve">, next to the DEG/RAD pill) advances to the next entry in </w:t>
+      </w:r>
+      <w:r>
+        <w:rPr>
+          <w:rFonts w:ascii="Consolas" w:cs="Consolas" w:eastAsia="Consolas" w:hAnsi="Consolas"/>
+          <w:sz w:val="20"/>
+          <w:szCs w:val="20"/>
+          <w:shd w:fill="EDEDED" w:val="clear"/>
+        </w:rPr>
+        <w:t xml:space="preserve">THEMES</w:t>
+      </w:r>
+      <w:r>
+        <w:t xml:space="preserve">, wrapping from Amber back to Classic.</w:t>
+      </w:r>
+    </w:p>
+    <w:p>
+      <w:pPr>
+        <w:spacing w:after="80" w:before="0"/>
+      </w:pPr>
+      <w:r>
+        <w:t xml:space="preserve">One deliberate exception: </w:t>
+      </w:r>
+      <w:r>
+        <w:rPr>
+          <w:rFonts w:ascii="Consolas" w:cs="Consolas" w:eastAsia="Consolas" w:hAnsi="Consolas"/>
+          <w:sz w:val="20"/>
+          <w:szCs w:val="20"/>
+          <w:shd w:fill="EDEDED" w:val="clear"/>
+        </w:rPr>
+        <w:t xml:space="preserve">.tape</w:t>
+      </w:r>
+      <w:r>
+        <w:t xml:space="preserve">'s paper background and ink colors are hardcoded rather than wired to theme variables, so the paper tape always looks the same regardless of the active theme — matching how real adding-machine paper doesn't change color with the machine's case.</w:t>
+      </w:r>
+    </w:p>
+    <w:p>
+      <w:pPr>
+        <w:spacing w:after="160" w:before="0"/>
+      </w:pPr>
+      <w:r>
+        <w:t xml:space="preserve">Adding a new theme is a data-only change: add another </w:t>
+      </w:r>
+      <w:r>
+        <w:rPr>
+          <w:rFonts w:ascii="Consolas" w:cs="Consolas" w:eastAsia="Consolas" w:hAnsi="Consolas"/>
+          <w:sz w:val="20"/>
+          <w:szCs w:val="20"/>
+          <w:shd w:fill="EDEDED" w:val="clear"/>
+        </w:rPr>
+        <w:t xml:space="preserve">[data-theme="..."]</w:t>
+      </w:r>
+      <w:r>
+        <w:t xml:space="preserve"> block redeclaring the full variable set with new values, then add its </w:t>
+      </w:r>
+      <w:r>
+        <w:rPr>
+          <w:rFonts w:ascii="Consolas" w:cs="Consolas" w:eastAsia="Consolas" w:hAnsi="Consolas"/>
+          <w:sz w:val="20"/>
+          <w:szCs w:val="20"/>
+          <w:shd w:fill="EDEDED" w:val="clear"/>
+        </w:rPr>
+        <w:t xml:space="preserve">{ id, label }</w:t>
+      </w:r>
+      <w:r>
+        <w:t xml:space="preserve"> to the </w:t>
+      </w:r>
+      <w:r>
+        <w:rPr>
+          <w:rFonts w:ascii="Consolas" w:cs="Consolas" w:eastAsia="Consolas" w:hAnsi="Consolas"/>
+          <w:sz w:val="20"/>
+          <w:szCs w:val="20"/>
+          <w:shd w:fill="EDEDED" w:val="clear"/>
+        </w:rPr>
+        <w:t xml:space="preserve">THEMES</w:t>
+      </w:r>
+      <w:r>
+        <w:t xml:space="preserve"> array in </w:t>
+      </w:r>
+      <w:r>
+        <w:rPr>
+          <w:rFonts w:ascii="Consolas" w:cs="Consolas" w:eastAsia="Consolas" w:hAnsi="Consolas"/>
+          <w:sz w:val="20"/>
+          <w:szCs w:val="20"/>
+          <w:shd w:fill="EDEDED" w:val="clear"/>
+        </w:rPr>
+        <w:t xml:space="preserve">app.js</w:t>
+      </w:r>
+      <w:r>
+        <w:t xml:space="preserve">. No other wiring is needed — the toggle button and persistence logic already iterate over that array.</w:t>
+      </w:r>
+    </w:p>
+    <w:p>
+      <w:pPr>
+        <w:pStyle w:val="Heading3"/>
+        <w:spacing w:after="100" w:before="240"/>
+      </w:pPr>
+      <w:r>
         <w:t xml:space="preserve">Key grid order</w:t>
       </w:r>
     </w:p>
@@ -5107,6 +5681,98 @@
       </w:r>
       <w:r>
         <w:t xml:space="preserve"> to a free rate API (e.g. Frankfurter.app, no key required), cached in memory with a timestamp so it isn't re-fetched on every button click, and a fallback for when the app is offline (the rest of the calculator works with no network at all, so this would be the first feature that doesn't).</w:t>
+      </w:r>
+    </w:p>
+    <w:p>
+      <w:pPr>
+        <w:pStyle w:val="ListParagraph"/>
+        <w:numPr>
+          <w:ilvl w:val="0"/>
+          <w:numId w:val="1"/>
+        </w:numPr>
+        <w:spacing w:after="80"/>
+      </w:pPr>
+      <w:r>
+        <w:rPr>
+          <w:b/>
+          <w:bCs/>
+        </w:rPr>
+        <w:t xml:space="preserve">More themes:</w:t>
+      </w:r>
+      <w:r>
+        <w:t xml:space="preserve"> add another </w:t>
+      </w:r>
+      <w:r>
+        <w:rPr>
+          <w:rFonts w:ascii="Consolas" w:cs="Consolas" w:eastAsia="Consolas" w:hAnsi="Consolas"/>
+          <w:sz w:val="20"/>
+          <w:szCs w:val="20"/>
+          <w:shd w:fill="EDEDED" w:val="clear"/>
+        </w:rPr>
+        <w:t xml:space="preserve">[data-theme="..."]</w:t>
+      </w:r>
+      <w:r>
+        <w:t xml:space="preserve"> block in </w:t>
+      </w:r>
+      <w:r>
+        <w:rPr>
+          <w:rFonts w:ascii="Consolas" w:cs="Consolas" w:eastAsia="Consolas" w:hAnsi="Consolas"/>
+          <w:sz w:val="20"/>
+          <w:szCs w:val="20"/>
+          <w:shd w:fill="EDEDED" w:val="clear"/>
+        </w:rPr>
+        <w:t xml:space="preserve">styles.css</w:t>
+      </w:r>
+      <w:r>
+        <w:t xml:space="preserve"> redeclaring the full variable set with new values, then add its </w:t>
+      </w:r>
+      <w:r>
+        <w:rPr>
+          <w:rFonts w:ascii="Consolas" w:cs="Consolas" w:eastAsia="Consolas" w:hAnsi="Consolas"/>
+          <w:sz w:val="20"/>
+          <w:szCs w:val="20"/>
+          <w:shd w:fill="EDEDED" w:val="clear"/>
+        </w:rPr>
+        <w:t xml:space="preserve">{ id, label }</w:t>
+      </w:r>
+      <w:r>
+        <w:t xml:space="preserve"> to the </w:t>
+      </w:r>
+      <w:r>
+        <w:rPr>
+          <w:rFonts w:ascii="Consolas" w:cs="Consolas" w:eastAsia="Consolas" w:hAnsi="Consolas"/>
+          <w:sz w:val="20"/>
+          <w:szCs w:val="20"/>
+          <w:shd w:fill="EDEDED" w:val="clear"/>
+        </w:rPr>
+        <w:t xml:space="preserve">THEMES</w:t>
+      </w:r>
+      <w:r>
+        <w:t xml:space="preserve"> array in </w:t>
+      </w:r>
+      <w:r>
+        <w:rPr>
+          <w:rFonts w:ascii="Consolas" w:cs="Consolas" w:eastAsia="Consolas" w:hAnsi="Consolas"/>
+          <w:sz w:val="20"/>
+          <w:szCs w:val="20"/>
+          <w:shd w:fill="EDEDED" w:val="clear"/>
+        </w:rPr>
+        <w:t xml:space="preserve">app.js</w:t>
+      </w:r>
+      <w:r>
+        <w:t xml:space="preserve">. No other code changes needed — the toggle button and </w:t>
+      </w:r>
+      <w:r>
+        <w:rPr>
+          <w:rFonts w:ascii="Consolas" w:cs="Consolas" w:eastAsia="Consolas" w:hAnsi="Consolas"/>
+          <w:sz w:val="20"/>
+          <w:szCs w:val="20"/>
+          <w:shd w:fill="EDEDED" w:val="clear"/>
+        </w:rPr>
+        <w:t xml:space="preserve">localStorage</w:t>
+      </w:r>
+      <w:r>
+        <w:t xml:space="preserve"> persistence already iterate over that array.</w:t>
       </w:r>
     </w:p>
     <w:sectPr>

</xml_diff>

<commit_message>
Simplify to 4 themes: drop white-bg Crimson, invert Light into Blue
- Removed the [data-theme="crimson"] block (white background, crimson
  accents) - superseded by the inverted Crimson Dark theme, now just
  labeled "Crimson" in the UI
- Replaced the Light theme's colors with a deep navy background + white
  keys scheme (same inverted pattern as Crimson), relabeled "Blue"
- THEMES array in app.js: Classic, Blue, Crimson, Amber
- Updated USER_MANUAL.md/.docx and TECHNICAL_MANUAL.md/.docx
</commit_message>
<xml_diff>
--- a/TECHNICAL_MANUAL.docx
+++ b/TECHNICAL_MANUAL.docx
@@ -3929,6 +3929,18 @@
           <w:szCs w:val="20"/>
           <w:shd w:fill="EDEDED" w:val="clear"/>
         </w:rPr>
+        <w:t xml:space="preserve">--entry-accent</w:t>
+      </w:r>
+      <w:r>
+        <w:t xml:space="preserve">, </w:t>
+      </w:r>
+      <w:r>
+        <w:rPr>
+          <w:rFonts w:ascii="Consolas" w:cs="Consolas" w:eastAsia="Consolas" w:hAnsi="Consolas"/>
+          <w:sz w:val="20"/>
+          <w:szCs w:val="20"/>
+          <w:shd w:fill="EDEDED" w:val="clear"/>
+        </w:rPr>
         <w:t xml:space="preserve">--text</w:t>
       </w:r>
       <w:r>
@@ -3941,6 +3953,18 @@
           <w:szCs w:val="20"/>
           <w:shd w:fill="EDEDED" w:val="clear"/>
         </w:rPr>
+        <w:t xml:space="preserve">--key-text</w:t>
+      </w:r>
+      <w:r>
+        <w:t xml:space="preserve">, </w:t>
+      </w:r>
+      <w:r>
+        <w:rPr>
+          <w:rFonts w:ascii="Consolas" w:cs="Consolas" w:eastAsia="Consolas" w:hAnsi="Consolas"/>
+          <w:sz w:val="20"/>
+          <w:szCs w:val="20"/>
+          <w:shd w:fill="EDEDED" w:val="clear"/>
+        </w:rPr>
         <w:t xml:space="preserve">--text-dim</w:t>
       </w:r>
       <w:r>
@@ -4048,6 +4072,102 @@
         <w:t xml:space="preserve">[data-theme="light"]</w:t>
       </w:r>
       <w:r>
+        <w:t xml:space="preserve"> (labeled "Blue" in the UI), </w:t>
+      </w:r>
+      <w:r>
+        <w:rPr>
+          <w:rFonts w:ascii="Consolas" w:cs="Consolas" w:eastAsia="Consolas" w:hAnsi="Consolas"/>
+          <w:sz w:val="20"/>
+          <w:szCs w:val="20"/>
+          <w:shd w:fill="EDEDED" w:val="clear"/>
+        </w:rPr>
+        <w:t xml:space="preserve">[data-theme="crimson-dark"]</w:t>
+      </w:r>
+      <w:r>
+        <w:t xml:space="preserve"> (labeled "Crimson"), </w:t>
+      </w:r>
+      <w:r>
+        <w:rPr>
+          <w:rFonts w:ascii="Consolas" w:cs="Consolas" w:eastAsia="Consolas" w:hAnsi="Consolas"/>
+          <w:sz w:val="20"/>
+          <w:szCs w:val="20"/>
+          <w:shd w:fill="EDEDED" w:val="clear"/>
+        </w:rPr>
+        <w:t xml:space="preserve">[data-theme="amber"]</w:t>
+      </w:r>
+      <w:r>
+        <w:t xml:space="preserve"> — sit right after </w:t>
+      </w:r>
+      <w:r>
+        <w:rPr>
+          <w:rFonts w:ascii="Consolas" w:cs="Consolas" w:eastAsia="Consolas" w:hAnsi="Consolas"/>
+          <w:sz w:val="20"/>
+          <w:szCs w:val="20"/>
+          <w:shd w:fill="EDEDED" w:val="clear"/>
+        </w:rPr>
+        <w:t xml:space="preserve">:root</w:t>
+      </w:r>
+      <w:r>
+        <w:t xml:space="preserve"> and override the variables whenever that attribute is present on </w:t>
+      </w:r>
+      <w:r>
+        <w:rPr>
+          <w:rFonts w:ascii="Consolas" w:cs="Consolas" w:eastAsia="Consolas" w:hAnsi="Consolas"/>
+          <w:sz w:val="20"/>
+          <w:szCs w:val="20"/>
+          <w:shd w:fill="EDEDED" w:val="clear"/>
+        </w:rPr>
+        <w:t xml:space="preserve">&lt;html&gt;</w:t>
+      </w:r>
+      <w:r>
+        <w:t xml:space="preserve">. The default ("Classic") theme is simply the bare </w:t>
+      </w:r>
+      <w:r>
+        <w:rPr>
+          <w:rFonts w:ascii="Consolas" w:cs="Consolas" w:eastAsia="Consolas" w:hAnsi="Consolas"/>
+          <w:sz w:val="20"/>
+          <w:szCs w:val="20"/>
+          <w:shd w:fill="EDEDED" w:val="clear"/>
+        </w:rPr>
+        <w:t xml:space="preserve">:root</w:t>
+      </w:r>
+      <w:r>
+        <w:t xml:space="preserve"> values with no </w:t>
+      </w:r>
+      <w:r>
+        <w:rPr>
+          <w:rFonts w:ascii="Consolas" w:cs="Consolas" w:eastAsia="Consolas" w:hAnsi="Consolas"/>
+          <w:sz w:val="20"/>
+          <w:szCs w:val="20"/>
+          <w:shd w:fill="EDEDED" w:val="clear"/>
+        </w:rPr>
+        <w:t xml:space="preserve">data-theme</w:t>
+      </w:r>
+      <w:r>
+        <w:t xml:space="preserve"> attribute at all, so existing saved state with nothing set still renders exactly as before the feature was added. Note the </w:t>
+      </w:r>
+      <w:r>
+        <w:rPr>
+          <w:rFonts w:ascii="Consolas" w:cs="Consolas" w:eastAsia="Consolas" w:hAnsi="Consolas"/>
+          <w:sz w:val="20"/>
+          <w:szCs w:val="20"/>
+          <w:shd w:fill="EDEDED" w:val="clear"/>
+        </w:rPr>
+        <w:t xml:space="preserve">data-theme</w:t>
+      </w:r>
+      <w:r>
+        <w:t xml:space="preserve"> attribute values (</w:t>
+      </w:r>
+      <w:r>
+        <w:rPr>
+          <w:rFonts w:ascii="Consolas" w:cs="Consolas" w:eastAsia="Consolas" w:hAnsi="Consolas"/>
+          <w:sz w:val="20"/>
+          <w:szCs w:val="20"/>
+          <w:shd w:fill="EDEDED" w:val="clear"/>
+        </w:rPr>
+        <w:t xml:space="preserve">light</w:t>
+      </w:r>
+      <w:r>
         <w:t xml:space="preserve">, </w:t>
       </w:r>
       <w:r>
@@ -4057,70 +4177,22 @@
           <w:szCs w:val="20"/>
           <w:shd w:fill="EDEDED" w:val="clear"/>
         </w:rPr>
-        <w:t xml:space="preserve">[data-theme="crimson"]</w:t>
-      </w:r>
-      <w:r>
-        <w:t xml:space="preserve">, </w:t>
-      </w:r>
-      <w:r>
-        <w:rPr>
-          <w:rFonts w:ascii="Consolas" w:cs="Consolas" w:eastAsia="Consolas" w:hAnsi="Consolas"/>
-          <w:sz w:val="20"/>
-          <w:szCs w:val="20"/>
-          <w:shd w:fill="EDEDED" w:val="clear"/>
-        </w:rPr>
-        <w:t xml:space="preserve">[data-theme="amber"]</w:t>
-      </w:r>
-      <w:r>
-        <w:t xml:space="preserve"> — sit right after </w:t>
-      </w:r>
-      <w:r>
-        <w:rPr>
-          <w:rFonts w:ascii="Consolas" w:cs="Consolas" w:eastAsia="Consolas" w:hAnsi="Consolas"/>
-          <w:sz w:val="20"/>
-          <w:szCs w:val="20"/>
-          <w:shd w:fill="EDEDED" w:val="clear"/>
-        </w:rPr>
-        <w:t xml:space="preserve">:root</w:t>
-      </w:r>
-      <w:r>
-        <w:t xml:space="preserve"> and override the variables whenever that attribute is present on </w:t>
-      </w:r>
-      <w:r>
-        <w:rPr>
-          <w:rFonts w:ascii="Consolas" w:cs="Consolas" w:eastAsia="Consolas" w:hAnsi="Consolas"/>
-          <w:sz w:val="20"/>
-          <w:szCs w:val="20"/>
-          <w:shd w:fill="EDEDED" w:val="clear"/>
-        </w:rPr>
-        <w:t xml:space="preserve">&lt;html&gt;</w:t>
-      </w:r>
-      <w:r>
-        <w:t xml:space="preserve">. The default ("Classic") theme is simply the bare </w:t>
-      </w:r>
-      <w:r>
-        <w:rPr>
-          <w:rFonts w:ascii="Consolas" w:cs="Consolas" w:eastAsia="Consolas" w:hAnsi="Consolas"/>
-          <w:sz w:val="20"/>
-          <w:szCs w:val="20"/>
-          <w:shd w:fill="EDEDED" w:val="clear"/>
-        </w:rPr>
-        <w:t xml:space="preserve">:root</w:t>
-      </w:r>
-      <w:r>
-        <w:t xml:space="preserve"> values with no </w:t>
-      </w:r>
-      <w:r>
-        <w:rPr>
-          <w:rFonts w:ascii="Consolas" w:cs="Consolas" w:eastAsia="Consolas" w:hAnsi="Consolas"/>
-          <w:sz w:val="20"/>
-          <w:szCs w:val="20"/>
-          <w:shd w:fill="EDEDED" w:val="clear"/>
-        </w:rPr>
-        <w:t xml:space="preserve">data-theme</w:t>
-      </w:r>
-      <w:r>
-        <w:t xml:space="preserve"> attribute at all, so existing saved state with nothing set still renders exactly as before the feature was added.</w:t>
+        <w:t xml:space="preserve">crimson-dark</w:t>
+      </w:r>
+      <w:r>
+        <w:t xml:space="preserve">) no longer match their current on-screen labels ("Blue", "Crimson") — they're leftover internal ids from when Blue was a light theme and Crimson had a separate light and dark variant; renaming the ids would mean a one-time migration for anyone with an old value already saved in </w:t>
+      </w:r>
+      <w:r>
+        <w:rPr>
+          <w:rFonts w:ascii="Consolas" w:cs="Consolas" w:eastAsia="Consolas" w:hAnsi="Consolas"/>
+          <w:sz w:val="20"/>
+          <w:szCs w:val="20"/>
+          <w:shd w:fill="EDEDED" w:val="clear"/>
+        </w:rPr>
+        <w:t xml:space="preserve">localStorage</w:t>
+      </w:r>
+      <w:r>
+        <w:t xml:space="preserve">, which isn't worth it for an internal identifier nobody but the code ever sees.</w:t>
       </w:r>
     </w:p>
     <w:p>
@@ -4282,6 +4354,206 @@
       </w:r>
       <w:r>
         <w:t xml:space="preserve">, wrapping from Amber back to Classic.</w:t>
+      </w:r>
+    </w:p>
+    <w:p>
+      <w:pPr>
+        <w:spacing w:after="80" w:before="0"/>
+      </w:pPr>
+      <w:r>
+        <w:t xml:space="preserve">Why </w:t>
+      </w:r>
+      <w:r>
+        <w:rPr>
+          <w:rFonts w:ascii="Consolas" w:cs="Consolas" w:eastAsia="Consolas" w:hAnsi="Consolas"/>
+          <w:sz w:val="20"/>
+          <w:szCs w:val="20"/>
+          <w:shd w:fill="EDEDED" w:val="clear"/>
+        </w:rPr>
+        <w:t xml:space="preserve">--key-text</w:t>
+      </w:r>
+      <w:r>
+        <w:t xml:space="preserve"> and </w:t>
+      </w:r>
+      <w:r>
+        <w:rPr>
+          <w:rFonts w:ascii="Consolas" w:cs="Consolas" w:eastAsia="Consolas" w:hAnsi="Consolas"/>
+          <w:sz w:val="20"/>
+          <w:szCs w:val="20"/>
+          <w:shd w:fill="EDEDED" w:val="clear"/>
+        </w:rPr>
+        <w:t xml:space="preserve">--entry-accent</w:t>
+      </w:r>
+      <w:r>
+        <w:t xml:space="preserve"> are separate from </w:t>
+      </w:r>
+      <w:r>
+        <w:rPr>
+          <w:rFonts w:ascii="Consolas" w:cs="Consolas" w:eastAsia="Consolas" w:hAnsi="Consolas"/>
+          <w:sz w:val="20"/>
+          <w:szCs w:val="20"/>
+          <w:shd w:fill="EDEDED" w:val="clear"/>
+        </w:rPr>
+        <w:t xml:space="preserve">--text</w:t>
+      </w:r>
+      <w:r>
+        <w:t xml:space="preserve"> and </w:t>
+      </w:r>
+      <w:r>
+        <w:rPr>
+          <w:rFonts w:ascii="Consolas" w:cs="Consolas" w:eastAsia="Consolas" w:hAnsi="Consolas"/>
+          <w:sz w:val="20"/>
+          <w:szCs w:val="20"/>
+          <w:shd w:fill="EDEDED" w:val="clear"/>
+        </w:rPr>
+        <w:t xml:space="preserve">--accent-2</w:t>
+      </w:r>
+      <w:r>
+        <w:t xml:space="preserve">: Classic and Amber keep the key faces (</w:t>
+      </w:r>
+      <w:r>
+        <w:rPr>
+          <w:rFonts w:ascii="Consolas" w:cs="Consolas" w:eastAsia="Consolas" w:hAnsi="Consolas"/>
+          <w:sz w:val="20"/>
+          <w:szCs w:val="20"/>
+          <w:shd w:fill="EDEDED" w:val="clear"/>
+        </w:rPr>
+        <w:t xml:space="preserve">--key-bg</w:t>
+      </w:r>
+      <w:r>
+        <w:t xml:space="preserve">) the same brightness family as the panel/body (dark theme = dark everything), so </w:t>
+      </w:r>
+      <w:r>
+        <w:rPr>
+          <w:rFonts w:ascii="Consolas" w:cs="Consolas" w:eastAsia="Consolas" w:hAnsi="Consolas"/>
+          <w:sz w:val="20"/>
+          <w:szCs w:val="20"/>
+          <w:shd w:fill="EDEDED" w:val="clear"/>
+        </w:rPr>
+        <w:t xml:space="preserve">.key</w:t>
+      </w:r>
+      <w:r>
+        <w:t xml:space="preserve">/</w:t>
+      </w:r>
+      <w:r>
+        <w:rPr>
+          <w:rFonts w:ascii="Consolas" w:cs="Consolas" w:eastAsia="Consolas" w:hAnsi="Consolas"/>
+          <w:sz w:val="20"/>
+          <w:szCs w:val="20"/>
+          <w:shd w:fill="EDEDED" w:val="clear"/>
+        </w:rPr>
+        <w:t xml:space="preserve">.pill</w:t>
+      </w:r>
+      <w:r>
+        <w:t xml:space="preserve"> can safely reuse </w:t>
+      </w:r>
+      <w:r>
+        <w:rPr>
+          <w:rFonts w:ascii="Consolas" w:cs="Consolas" w:eastAsia="Consolas" w:hAnsi="Consolas"/>
+          <w:sz w:val="20"/>
+          <w:szCs w:val="20"/>
+          <w:shd w:fill="EDEDED" w:val="clear"/>
+        </w:rPr>
+        <w:t xml:space="preserve">--text</w:t>
+      </w:r>
+      <w:r>
+        <w:t xml:space="preserve"> for their label color and </w:t>
+      </w:r>
+      <w:r>
+        <w:rPr>
+          <w:rFonts w:ascii="Consolas" w:cs="Consolas" w:eastAsia="Consolas" w:hAnsi="Consolas"/>
+          <w:sz w:val="20"/>
+          <w:szCs w:val="20"/>
+          <w:shd w:fill="EDEDED" w:val="clear"/>
+        </w:rPr>
+        <w:t xml:space="preserve">.entry-label</w:t>
+      </w:r>
+      <w:r>
+        <w:t xml:space="preserve"> can reuse </w:t>
+      </w:r>
+      <w:r>
+        <w:rPr>
+          <w:rFonts w:ascii="Consolas" w:cs="Consolas" w:eastAsia="Consolas" w:hAnsi="Consolas"/>
+          <w:sz w:val="20"/>
+          <w:szCs w:val="20"/>
+          <w:shd w:fill="EDEDED" w:val="clear"/>
+        </w:rPr>
+        <w:t xml:space="preserve">--accent-2</w:t>
+      </w:r>
+      <w:r>
+        <w:t xml:space="preserve">. Blue and Crimson break that assumption on purpose — each is a dark, saturated body color (navy / maroon) with white keys — so a single dark-vs-light </w:t>
+      </w:r>
+      <w:r>
+        <w:rPr>
+          <w:rFonts w:ascii="Consolas" w:cs="Consolas" w:eastAsia="Consolas" w:hAnsi="Consolas"/>
+          <w:sz w:val="20"/>
+          <w:szCs w:val="20"/>
+          <w:shd w:fill="EDEDED" w:val="clear"/>
+        </w:rPr>
+        <w:t xml:space="preserve">--text</w:t>
+      </w:r>
+      <w:r>
+        <w:t xml:space="preserve"> value can't serve both the panel labels and the key labels, and a single </w:t>
+      </w:r>
+      <w:r>
+        <w:rPr>
+          <w:rFonts w:ascii="Consolas" w:cs="Consolas" w:eastAsia="Consolas" w:hAnsi="Consolas"/>
+          <w:sz w:val="20"/>
+          <w:szCs w:val="20"/>
+          <w:shd w:fill="EDEDED" w:val="clear"/>
+        </w:rPr>
+        <w:t xml:space="preserve">--accent-2</w:t>
+      </w:r>
+      <w:r>
+        <w:t xml:space="preserve"> (used as the Enter key's dark background) can't also work as light-on-dark label text for the "x:" prefix on the display. </w:t>
+      </w:r>
+      <w:r>
+        <w:rPr>
+          <w:rFonts w:ascii="Consolas" w:cs="Consolas" w:eastAsia="Consolas" w:hAnsi="Consolas"/>
+          <w:sz w:val="20"/>
+          <w:szCs w:val="20"/>
+          <w:shd w:fill="EDEDED" w:val="clear"/>
+        </w:rPr>
+        <w:t xml:space="preserve">--key-text</w:t>
+      </w:r>
+      <w:r>
+        <w:t xml:space="preserve"> decouples key/pill label color from general panel text; </w:t>
+      </w:r>
+      <w:r>
+        <w:rPr>
+          <w:rFonts w:ascii="Consolas" w:cs="Consolas" w:eastAsia="Consolas" w:hAnsi="Consolas"/>
+          <w:sz w:val="20"/>
+          <w:szCs w:val="20"/>
+          <w:shd w:fill="EDEDED" w:val="clear"/>
+        </w:rPr>
+        <w:t xml:space="preserve">--entry-accent</w:t>
+      </w:r>
+      <w:r>
+        <w:t xml:space="preserve"> decouples the "x:" label's color from the Enter key's background color. For Classic and Amber, both new variables are just set equal to their </w:t>
+      </w:r>
+      <w:r>
+        <w:rPr>
+          <w:rFonts w:ascii="Consolas" w:cs="Consolas" w:eastAsia="Consolas" w:hAnsi="Consolas"/>
+          <w:sz w:val="20"/>
+          <w:szCs w:val="20"/>
+          <w:shd w:fill="EDEDED" w:val="clear"/>
+        </w:rPr>
+        <w:t xml:space="preserve">--text</w:t>
+      </w:r>
+      <w:r>
+        <w:t xml:space="preserve">/</w:t>
+      </w:r>
+      <w:r>
+        <w:rPr>
+          <w:rFonts w:ascii="Consolas" w:cs="Consolas" w:eastAsia="Consolas" w:hAnsi="Consolas"/>
+          <w:sz w:val="20"/>
+          <w:szCs w:val="20"/>
+          <w:shd w:fill="EDEDED" w:val="clear"/>
+        </w:rPr>
+        <w:t xml:space="preserve">--accent-2</w:t>
+      </w:r>
+      <w:r>
+        <w:t xml:space="preserve"> counterparts, so nothing about them changed visually.</w:t>
       </w:r>
     </w:p>
     <w:p>

</xml_diff>